<commit_message>
Update resume contact email to ayubleon.pd@gmail.com
Co-Authored-By: Claude Sonnet 5 <noreply@anthropic.com>
</commit_message>
<xml_diff>
--- a/Ayub Leon - Resume.docx
+++ b/Ayub Leon - Resume.docx
@@ -47,7 +47,7 @@
       <w:pPr>
         <w:spacing w:after="100"/>
       </w:pPr>
-      <w:hyperlink w:history="1" r:id="rIdktyjyqzktjyqhkw-mfnzq">
+      <w:hyperlink w:history="1" r:id="rIdsw17kldi5xeckzuocdxuc">
         <w:r>
           <w:rPr>
             <w:rFonts w:ascii="Calibri" w:cs="Calibri" w:eastAsia="Calibri" w:hAnsi="Calibri"/>
@@ -67,7 +67,7 @@
         </w:rPr>
         <w:t xml:space="preserve"> | </w:t>
       </w:r>
-      <w:hyperlink w:history="1" r:id="rId_2s916mtwaynqdquf-qg2">
+      <w:hyperlink w:history="1" r:id="rIdooxyxnt4186vfdwnilc4j">
         <w:r>
           <w:rPr>
             <w:rFonts w:ascii="Calibri" w:cs="Calibri" w:eastAsia="Calibri" w:hAnsi="Calibri"/>
@@ -87,7 +87,7 @@
         </w:rPr>
         <w:t xml:space="preserve"> | </w:t>
       </w:r>
-      <w:hyperlink w:history="1" r:id="rIdxfvfvt_xhu0eggdvwdctc">
+      <w:hyperlink w:history="1" r:id="rIdjfiud7sdq1idd23ydedeu">
         <w:r>
           <w:rPr>
             <w:rFonts w:ascii="Calibri" w:cs="Calibri" w:eastAsia="Calibri" w:hAnsi="Calibri"/>
@@ -96,7 +96,7 @@
             <w:szCs w:val="20"/>
             <w:u w:val="single"/>
           </w:rPr>
-          <w:t xml:space="preserve">ayubleon9@gmail.com</w:t>
+          <w:t xml:space="preserve">ayubleon.pd@gmail.com</w:t>
         </w:r>
       </w:hyperlink>
     </w:p>

</xml_diff>